<commit_message>
Add audio files and documentation for UE-4 exercise
Added multiple audio files (WAV, MP3), render statistics, protocol documents, backup, and related media for the UE-4 exercise in Audio Video Technology. Updated exercise notes and protocol to reflect new materials and results.
</commit_message>
<xml_diff>
--- a/Modules/Semester_1/Video Audio Technik/Übungen Audio/UE-4/Protokoll.docx
+++ b/Modules/Semester_1/Video Audio Technik/Übungen Audio/UE-4/Protokoll.docx
@@ -695,13 +695,1841 @@
       </w:r>
     </w:p>
     <w:p>
+      <w:pPr>
+        <w:pStyle w:val="Heading1"/>
+      </w:pPr>
       <w:r>
         <w:lastRenderedPageBreak/>
+        <w:t>Equipment</w:t>
+      </w:r>
+    </w:p>
+    <w:p>
+      <w:pPr>
+        <w:rPr>
+          <w:lang w:val="en-US"/>
+        </w:rPr>
+      </w:pPr>
+      <w:r>
+        <w:rPr>
+          <w:lang w:val="en-US"/>
+        </w:rPr>
+        <w:t>Focusrite Scarlett 2i2 3rd G</w:t>
+      </w:r>
+      <w:r>
+        <w:rPr>
+          <w:lang w:val="en-US"/>
+        </w:rPr>
+        <w:t>en</w:t>
+      </w:r>
+    </w:p>
+    <w:p>
+      <w:pPr>
+        <w:rPr>
+          <w:lang w:val="en-US"/>
+        </w:rPr>
+      </w:pPr>
+      <w:r>
+        <w:rPr>
+          <w:lang w:val="en-US"/>
+        </w:rPr>
+        <w:t>SM58 Microphone</w:t>
+      </w:r>
+    </w:p>
+    <w:p>
+      <w:pPr>
+        <w:rPr>
+          <w:lang w:val="en-US"/>
+        </w:rPr>
+      </w:pPr>
+      <w:r>
+        <w:rPr>
+          <w:noProof/>
+        </w:rPr>
+        <mc:AlternateContent>
+          <mc:Choice Requires="wps">
+            <w:drawing>
+              <wp:anchor distT="0" distB="0" distL="114300" distR="114300" simplePos="0" relativeHeight="251699200" behindDoc="0" locked="0" layoutInCell="1" allowOverlap="1" wp14:anchorId="7101E1DF" wp14:editId="01C9D4F7">
+                <wp:simplePos x="0" y="0"/>
+                <wp:positionH relativeFrom="column">
+                  <wp:posOffset>1134110</wp:posOffset>
+                </wp:positionH>
+                <wp:positionV relativeFrom="paragraph">
+                  <wp:posOffset>4203700</wp:posOffset>
+                </wp:positionV>
+                <wp:extent cx="2905125" cy="635"/>
+                <wp:effectExtent l="0" t="0" r="0" b="0"/>
+                <wp:wrapTopAndBottom/>
+                <wp:docPr id="1208843749" name="Text Box 1"/>
+                <wp:cNvGraphicFramePr/>
+                <a:graphic xmlns:a="http://schemas.openxmlformats.org/drawingml/2006/main">
+                  <a:graphicData uri="http://schemas.microsoft.com/office/word/2010/wordprocessingShape">
+                    <wps:wsp>
+                      <wps:cNvSpPr txBox="1"/>
+                      <wps:spPr>
+                        <a:xfrm>
+                          <a:off x="0" y="0"/>
+                          <a:ext cx="2905125" cy="635"/>
+                        </a:xfrm>
+                        <a:prstGeom prst="rect">
+                          <a:avLst/>
+                        </a:prstGeom>
+                        <a:solidFill>
+                          <a:prstClr val="white"/>
+                        </a:solidFill>
+                        <a:ln>
+                          <a:noFill/>
+                        </a:ln>
+                      </wps:spPr>
+                      <wps:txbx>
+                        <w:txbxContent>
+                          <w:p>
+                            <w:pPr>
+                              <w:pStyle w:val="Caption"/>
+                            </w:pPr>
+                            <w:r>
+                              <w:t xml:space="preserve">Abbildung </w:t>
+                            </w:r>
+                            <w:r>
+                              <w:fldChar w:fldCharType="begin"/>
+                            </w:r>
+                            <w:r>
+                              <w:instrText xml:space="preserve"> SEQ Abbildung \* ARABIC </w:instrText>
+                            </w:r>
+                            <w:r>
+                              <w:fldChar w:fldCharType="separate"/>
+                            </w:r>
+                            <w:r>
+                              <w:rPr>
+                                <w:noProof/>
+                              </w:rPr>
+                              <w:t>1</w:t>
+                            </w:r>
+                            <w:r>
+                              <w:fldChar w:fldCharType="end"/>
+                            </w:r>
+                            <w:r>
+                              <w:t>: Equipment</w:t>
+                            </w:r>
+                          </w:p>
+                        </w:txbxContent>
+                      </wps:txbx>
+                      <wps:bodyPr rot="0" spcFirstLastPara="0" vertOverflow="overflow" horzOverflow="overflow" vert="horz" wrap="square" lIns="0" tIns="0" rIns="0" bIns="0" numCol="1" spcCol="0" rtlCol="0" fromWordArt="0" anchor="t" anchorCtr="0" forceAA="0" compatLnSpc="1">
+                        <a:prstTxWarp prst="textNoShape">
+                          <a:avLst/>
+                        </a:prstTxWarp>
+                        <a:spAutoFit/>
+                      </wps:bodyPr>
+                    </wps:wsp>
+                  </a:graphicData>
+                </a:graphic>
+              </wp:anchor>
+            </w:drawing>
+          </mc:Choice>
+          <mc:Fallback>
+            <w:pict>
+              <v:shape w14:anchorId="7101E1DF" id="Text Box 1" o:spid="_x0000_s1030" type="#_x0000_t202" style="position:absolute;left:0;text-align:left;margin-left:89.3pt;margin-top:331pt;width:228.75pt;height:.05pt;z-index:251699200;visibility:visible;mso-wrap-style:square;mso-wrap-distance-left:9pt;mso-wrap-distance-top:0;mso-wrap-distance-right:9pt;mso-wrap-distance-bottom:0;mso-position-horizontal:absolute;mso-position-horizontal-relative:text;mso-position-vertical:absolute;mso-position-vertical-relative:text;v-text-anchor:top" o:gfxdata="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" stroked="f">
+                <v:textbox style="mso-fit-shape-to-text:t" inset="0,0,0,0">
+                  <w:txbxContent>
+                    <w:p>
+                      <w:pPr>
+                        <w:pStyle w:val="Caption"/>
+                      </w:pPr>
+                      <w:r>
+                        <w:t xml:space="preserve">Abbildung </w:t>
+                      </w:r>
+                      <w:r>
+                        <w:fldChar w:fldCharType="begin"/>
+                      </w:r>
+                      <w:r>
+                        <w:instrText xml:space="preserve"> SEQ Abbildung \* ARABIC </w:instrText>
+                      </w:r>
+                      <w:r>
+                        <w:fldChar w:fldCharType="separate"/>
+                      </w:r>
+                      <w:r>
+                        <w:rPr>
+                          <w:noProof/>
+                        </w:rPr>
+                        <w:t>1</w:t>
+                      </w:r>
+                      <w:r>
+                        <w:fldChar w:fldCharType="end"/>
+                      </w:r>
+                      <w:r>
+                        <w:t>: Equipment</w:t>
+                      </w:r>
+                    </w:p>
+                  </w:txbxContent>
+                </v:textbox>
+                <w10:wrap type="topAndBottom"/>
+              </v:shape>
+            </w:pict>
+          </mc:Fallback>
+        </mc:AlternateContent>
+      </w:r>
+      <w:r>
+        <w:drawing>
+          <wp:anchor distT="0" distB="0" distL="114300" distR="114300" simplePos="0" relativeHeight="251697152" behindDoc="0" locked="0" layoutInCell="1" allowOverlap="1" wp14:anchorId="79699851" wp14:editId="38F8831D">
+            <wp:simplePos x="0" y="0"/>
+            <wp:positionH relativeFrom="margin">
+              <wp:align>center</wp:align>
+            </wp:positionH>
+            <wp:positionV relativeFrom="paragraph">
+              <wp:posOffset>184150</wp:posOffset>
+            </wp:positionV>
+            <wp:extent cx="2905530" cy="3962953"/>
+            <wp:effectExtent l="0" t="0" r="9525" b="0"/>
+            <wp:wrapTopAndBottom/>
+            <wp:docPr id="1067870060" name="Picture 1" descr="A hand holding a microphone next to a red box&#10;&#10;AI-generated content may be incorrect."/>
+            <wp:cNvGraphicFramePr>
+              <a:graphicFrameLocks xmlns:a="http://schemas.openxmlformats.org/drawingml/2006/main" noChangeAspect="1"/>
+            </wp:cNvGraphicFramePr>
+            <a:graphic xmlns:a="http://schemas.openxmlformats.org/drawingml/2006/main">
+              <a:graphicData uri="http://schemas.openxmlformats.org/drawingml/2006/picture">
+                <pic:pic xmlns:pic="http://schemas.openxmlformats.org/drawingml/2006/picture">
+                  <pic:nvPicPr>
+                    <pic:cNvPr id="1067870060" name="Picture 1" descr="A hand holding a microphone next to a red box&#10;&#10;AI-generated content may be incorrect."/>
+                    <pic:cNvPicPr/>
+                  </pic:nvPicPr>
+                  <pic:blipFill>
+                    <a:blip r:embed="rId8">
+                      <a:extLst>
+                        <a:ext uri="{28A0092B-C50C-407E-A947-70E740481C1C}">
+                          <a14:useLocalDpi xmlns:a14="http://schemas.microsoft.com/office/drawing/2010/main" val="0"/>
+                        </a:ext>
+                      </a:extLst>
+                    </a:blip>
+                    <a:stretch>
+                      <a:fillRect/>
+                    </a:stretch>
+                  </pic:blipFill>
+                  <pic:spPr>
+                    <a:xfrm>
+                      <a:off x="0" y="0"/>
+                      <a:ext cx="2905530" cy="3962953"/>
+                    </a:xfrm>
+                    <a:prstGeom prst="rect">
+                      <a:avLst/>
+                    </a:prstGeom>
+                  </pic:spPr>
+                </pic:pic>
+              </a:graphicData>
+            </a:graphic>
+          </wp:anchor>
+        </w:drawing>
+      </w:r>
+    </w:p>
+    <w:p>
+      <w:pPr>
+        <w:jc w:val="left"/>
+        <w:rPr>
+          <w:rFonts w:eastAsiaTheme="majorEastAsia" w:cstheme="majorBidi"/>
+          <w:b/>
+          <w:color w:val="4D0264"/>
+          <w:sz w:val="40"/>
+          <w:szCs w:val="40"/>
+        </w:rPr>
+      </w:pPr>
+      <w:r>
+        <w:br w:type="page"/>
+      </w:r>
+    </w:p>
+    <w:p>
+      <w:pPr>
+        <w:pStyle w:val="Heading1"/>
+      </w:pPr>
+      <w:r>
+        <w:lastRenderedPageBreak/>
+        <w:t>AUFGABE 1: Aufnahme und Mix</w:t>
+      </w:r>
+    </w:p>
+    <w:p>
+      <w:r>
+        <w:rPr>
+          <w:noProof/>
+        </w:rPr>
+        <mc:AlternateContent>
+          <mc:Choice Requires="wps">
+            <w:drawing>
+              <wp:anchor distT="0" distB="0" distL="114300" distR="114300" simplePos="0" relativeHeight="251702272" behindDoc="0" locked="0" layoutInCell="1" allowOverlap="1" wp14:anchorId="761369E2" wp14:editId="14A3EC54">
+                <wp:simplePos x="0" y="0"/>
+                <wp:positionH relativeFrom="column">
+                  <wp:posOffset>0</wp:posOffset>
+                </wp:positionH>
+                <wp:positionV relativeFrom="paragraph">
+                  <wp:posOffset>3459480</wp:posOffset>
+                </wp:positionV>
+                <wp:extent cx="5182870" cy="635"/>
+                <wp:effectExtent l="0" t="0" r="0" b="0"/>
+                <wp:wrapTopAndBottom/>
+                <wp:docPr id="1466256201" name="Text Box 1"/>
+                <wp:cNvGraphicFramePr/>
+                <a:graphic xmlns:a="http://schemas.openxmlformats.org/drawingml/2006/main">
+                  <a:graphicData uri="http://schemas.microsoft.com/office/word/2010/wordprocessingShape">
+                    <wps:wsp>
+                      <wps:cNvSpPr txBox="1"/>
+                      <wps:spPr>
+                        <a:xfrm>
+                          <a:off x="0" y="0"/>
+                          <a:ext cx="5182870" cy="635"/>
+                        </a:xfrm>
+                        <a:prstGeom prst="rect">
+                          <a:avLst/>
+                        </a:prstGeom>
+                        <a:solidFill>
+                          <a:prstClr val="white"/>
+                        </a:solidFill>
+                        <a:ln>
+                          <a:noFill/>
+                        </a:ln>
+                      </wps:spPr>
+                      <wps:txbx>
+                        <w:txbxContent>
+                          <w:p>
+                            <w:pPr>
+                              <w:pStyle w:val="Caption"/>
+                            </w:pPr>
+                            <w:r>
+                              <w:t xml:space="preserve">Abbildung </w:t>
+                            </w:r>
+                            <w:r>
+                              <w:fldChar w:fldCharType="begin"/>
+                            </w:r>
+                            <w:r>
+                              <w:instrText xml:space="preserve"> SEQ Abbildung \* ARABIC </w:instrText>
+                            </w:r>
+                            <w:r>
+                              <w:fldChar w:fldCharType="separate"/>
+                            </w:r>
+                            <w:r>
+                              <w:rPr>
+                                <w:noProof/>
+                              </w:rPr>
+                              <w:t>2</w:t>
+                            </w:r>
+                            <w:r>
+                              <w:fldChar w:fldCharType="end"/>
+                            </w:r>
+                            <w:r>
+                              <w:t>: Threshold</w:t>
+                            </w:r>
+                          </w:p>
+                        </w:txbxContent>
+                      </wps:txbx>
+                      <wps:bodyPr rot="0" spcFirstLastPara="0" vertOverflow="overflow" horzOverflow="overflow" vert="horz" wrap="square" lIns="0" tIns="0" rIns="0" bIns="0" numCol="1" spcCol="0" rtlCol="0" fromWordArt="0" anchor="t" anchorCtr="0" forceAA="0" compatLnSpc="1">
+                        <a:prstTxWarp prst="textNoShape">
+                          <a:avLst/>
+                        </a:prstTxWarp>
+                        <a:spAutoFit/>
+                      </wps:bodyPr>
+                    </wps:wsp>
+                  </a:graphicData>
+                </a:graphic>
+              </wp:anchor>
+            </w:drawing>
+          </mc:Choice>
+          <mc:Fallback>
+            <w:pict>
+              <v:shape w14:anchorId="761369E2" id="_x0000_s1031" type="#_x0000_t202" style="position:absolute;left:0;text-align:left;margin-left:0;margin-top:272.4pt;width:408.1pt;height:.05pt;z-index:251702272;visibility:visible;mso-wrap-style:square;mso-wrap-distance-left:9pt;mso-wrap-distance-top:0;mso-wrap-distance-right:9pt;mso-wrap-distance-bottom:0;mso-position-horizontal:absolute;mso-position-horizontal-relative:text;mso-position-vertical:absolute;mso-position-vertical-relative:text;v-text-anchor:top" o:gfxdata="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" stroked="f">
+                <v:textbox style="mso-fit-shape-to-text:t" inset="0,0,0,0">
+                  <w:txbxContent>
+                    <w:p>
+                      <w:pPr>
+                        <w:pStyle w:val="Caption"/>
+                      </w:pPr>
+                      <w:r>
+                        <w:t xml:space="preserve">Abbildung </w:t>
+                      </w:r>
+                      <w:r>
+                        <w:fldChar w:fldCharType="begin"/>
+                      </w:r>
+                      <w:r>
+                        <w:instrText xml:space="preserve"> SEQ Abbildung \* ARABIC </w:instrText>
+                      </w:r>
+                      <w:r>
+                        <w:fldChar w:fldCharType="separate"/>
+                      </w:r>
+                      <w:r>
+                        <w:rPr>
+                          <w:noProof/>
+                        </w:rPr>
+                        <w:t>2</w:t>
+                      </w:r>
+                      <w:r>
+                        <w:fldChar w:fldCharType="end"/>
+                      </w:r>
+                      <w:r>
+                        <w:t>: Threshold</w:t>
+                      </w:r>
+                    </w:p>
+                  </w:txbxContent>
+                </v:textbox>
+                <w10:wrap type="topAndBottom"/>
+              </v:shape>
+            </w:pict>
+          </mc:Fallback>
+        </mc:AlternateContent>
+      </w:r>
+      <w:r>
+        <w:drawing>
+          <wp:anchor distT="0" distB="0" distL="114300" distR="114300" simplePos="0" relativeHeight="251700224" behindDoc="0" locked="0" layoutInCell="1" allowOverlap="1" wp14:anchorId="4C8FAA94" wp14:editId="385AF634">
+            <wp:simplePos x="0" y="0"/>
+            <wp:positionH relativeFrom="margin">
+              <wp:posOffset>0</wp:posOffset>
+            </wp:positionH>
+            <wp:positionV relativeFrom="paragraph">
+              <wp:posOffset>360875</wp:posOffset>
+            </wp:positionV>
+            <wp:extent cx="5182870" cy="3041650"/>
+            <wp:effectExtent l="0" t="0" r="0" b="6350"/>
+            <wp:wrapTopAndBottom/>
+            <wp:docPr id="660867336" name="Picture 1" descr="A screenshot of a computer&#10;&#10;AI-generated content may be incorrect."/>
+            <wp:cNvGraphicFramePr>
+              <a:graphicFrameLocks xmlns:a="http://schemas.openxmlformats.org/drawingml/2006/main" noChangeAspect="1"/>
+            </wp:cNvGraphicFramePr>
+            <a:graphic xmlns:a="http://schemas.openxmlformats.org/drawingml/2006/main">
+              <a:graphicData uri="http://schemas.openxmlformats.org/drawingml/2006/picture">
+                <pic:pic xmlns:pic="http://schemas.openxmlformats.org/drawingml/2006/picture">
+                  <pic:nvPicPr>
+                    <pic:cNvPr id="660867336" name="Picture 1" descr="A screenshot of a computer&#10;&#10;AI-generated content may be incorrect."/>
+                    <pic:cNvPicPr/>
+                  </pic:nvPicPr>
+                  <pic:blipFill>
+                    <a:blip r:embed="rId9">
+                      <a:extLst>
+                        <a:ext uri="{28A0092B-C50C-407E-A947-70E740481C1C}">
+                          <a14:useLocalDpi xmlns:a14="http://schemas.microsoft.com/office/drawing/2010/main" val="0"/>
+                        </a:ext>
+                      </a:extLst>
+                    </a:blip>
+                    <a:stretch>
+                      <a:fillRect/>
+                    </a:stretch>
+                  </pic:blipFill>
+                  <pic:spPr>
+                    <a:xfrm>
+                      <a:off x="0" y="0"/>
+                      <a:ext cx="5182870" cy="3041650"/>
+                    </a:xfrm>
+                    <a:prstGeom prst="rect">
+                      <a:avLst/>
+                    </a:prstGeom>
+                  </pic:spPr>
+                </pic:pic>
+              </a:graphicData>
+            </a:graphic>
+          </wp:anchor>
+        </w:drawing>
+      </w:r>
+    </w:p>
+    <w:p>
+      <w:r>
+        <w:rPr>
+          <w:noProof/>
+        </w:rPr>
+        <mc:AlternateContent>
+          <mc:Choice Requires="wps">
+            <w:drawing>
+              <wp:anchor distT="0" distB="0" distL="114300" distR="114300" simplePos="0" relativeHeight="251705344" behindDoc="0" locked="0" layoutInCell="1" allowOverlap="1" wp14:anchorId="64B19C23" wp14:editId="49368DBA">
+                <wp:simplePos x="0" y="0"/>
+                <wp:positionH relativeFrom="column">
+                  <wp:posOffset>438785</wp:posOffset>
+                </wp:positionH>
+                <wp:positionV relativeFrom="paragraph">
+                  <wp:posOffset>6736715</wp:posOffset>
+                </wp:positionV>
+                <wp:extent cx="4304665" cy="635"/>
+                <wp:effectExtent l="0" t="0" r="0" b="0"/>
+                <wp:wrapTopAndBottom/>
+                <wp:docPr id="1044694955" name="Text Box 1"/>
+                <wp:cNvGraphicFramePr/>
+                <a:graphic xmlns:a="http://schemas.openxmlformats.org/drawingml/2006/main">
+                  <a:graphicData uri="http://schemas.microsoft.com/office/word/2010/wordprocessingShape">
+                    <wps:wsp>
+                      <wps:cNvSpPr txBox="1"/>
+                      <wps:spPr>
+                        <a:xfrm>
+                          <a:off x="0" y="0"/>
+                          <a:ext cx="4304665" cy="635"/>
+                        </a:xfrm>
+                        <a:prstGeom prst="rect">
+                          <a:avLst/>
+                        </a:prstGeom>
+                        <a:solidFill>
+                          <a:prstClr val="white"/>
+                        </a:solidFill>
+                        <a:ln>
+                          <a:noFill/>
+                        </a:ln>
+                      </wps:spPr>
+                      <wps:txbx>
+                        <w:txbxContent>
+                          <w:p>
+                            <w:pPr>
+                              <w:pStyle w:val="Caption"/>
+                            </w:pPr>
+                            <w:r>
+                              <w:t xml:space="preserve">Abbildung </w:t>
+                            </w:r>
+                            <w:r>
+                              <w:fldChar w:fldCharType="begin"/>
+                            </w:r>
+                            <w:r>
+                              <w:instrText xml:space="preserve"> SEQ Abbildung \* ARABIC </w:instrText>
+                            </w:r>
+                            <w:r>
+                              <w:fldChar w:fldCharType="separate"/>
+                            </w:r>
+                            <w:r>
+                              <w:rPr>
+                                <w:noProof/>
+                              </w:rPr>
+                              <w:t>3</w:t>
+                            </w:r>
+                            <w:r>
+                              <w:fldChar w:fldCharType="end"/>
+                            </w:r>
+                            <w:r>
+                              <w:t>: EQ</w:t>
+                            </w:r>
+                          </w:p>
+                        </w:txbxContent>
+                      </wps:txbx>
+                      <wps:bodyPr rot="0" spcFirstLastPara="0" vertOverflow="overflow" horzOverflow="overflow" vert="horz" wrap="square" lIns="0" tIns="0" rIns="0" bIns="0" numCol="1" spcCol="0" rtlCol="0" fromWordArt="0" anchor="t" anchorCtr="0" forceAA="0" compatLnSpc="1">
+                        <a:prstTxWarp prst="textNoShape">
+                          <a:avLst/>
+                        </a:prstTxWarp>
+                        <a:spAutoFit/>
+                      </wps:bodyPr>
+                    </wps:wsp>
+                  </a:graphicData>
+                </a:graphic>
+              </wp:anchor>
+            </w:drawing>
+          </mc:Choice>
+          <mc:Fallback>
+            <w:pict>
+              <v:shape w14:anchorId="64B19C23" id="_x0000_s1032" type="#_x0000_t202" style="position:absolute;left:0;text-align:left;margin-left:34.55pt;margin-top:530.45pt;width:338.95pt;height:.05pt;z-index:251705344;visibility:visible;mso-wrap-style:square;mso-wrap-distance-left:9pt;mso-wrap-distance-top:0;mso-wrap-distance-right:9pt;mso-wrap-distance-bottom:0;mso-position-horizontal:absolute;mso-position-horizontal-relative:text;mso-position-vertical:absolute;mso-position-vertical-relative:text;v-text-anchor:top" o:gfxdata="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" stroked="f">
+                <v:textbox style="mso-fit-shape-to-text:t" inset="0,0,0,0">
+                  <w:txbxContent>
+                    <w:p>
+                      <w:pPr>
+                        <w:pStyle w:val="Caption"/>
+                      </w:pPr>
+                      <w:r>
+                        <w:t xml:space="preserve">Abbildung </w:t>
+                      </w:r>
+                      <w:r>
+                        <w:fldChar w:fldCharType="begin"/>
+                      </w:r>
+                      <w:r>
+                        <w:instrText xml:space="preserve"> SEQ Abbildung \* ARABIC </w:instrText>
+                      </w:r>
+                      <w:r>
+                        <w:fldChar w:fldCharType="separate"/>
+                      </w:r>
+                      <w:r>
+                        <w:rPr>
+                          <w:noProof/>
+                        </w:rPr>
+                        <w:t>3</w:t>
+                      </w:r>
+                      <w:r>
+                        <w:fldChar w:fldCharType="end"/>
+                      </w:r>
+                      <w:r>
+                        <w:t>: EQ</w:t>
+                      </w:r>
+                    </w:p>
+                  </w:txbxContent>
+                </v:textbox>
+                <w10:wrap type="topAndBottom"/>
+              </v:shape>
+            </w:pict>
+          </mc:Fallback>
+        </mc:AlternateContent>
+      </w:r>
+      <w:r>
+        <w:drawing>
+          <wp:anchor distT="0" distB="0" distL="114300" distR="114300" simplePos="0" relativeHeight="251703296" behindDoc="0" locked="0" layoutInCell="1" allowOverlap="1" wp14:anchorId="224F2711" wp14:editId="64DB3D40">
+            <wp:simplePos x="0" y="0"/>
+            <wp:positionH relativeFrom="margin">
+              <wp:align>center</wp:align>
+            </wp:positionH>
+            <wp:positionV relativeFrom="paragraph">
+              <wp:posOffset>3659017</wp:posOffset>
+            </wp:positionV>
+            <wp:extent cx="4304665" cy="3020695"/>
+            <wp:effectExtent l="0" t="0" r="635" b="8255"/>
+            <wp:wrapTopAndBottom/>
+            <wp:docPr id="1780905106" name="Picture 1" descr="A screenshot of a computer&#10;&#10;AI-generated content may be incorrect."/>
+            <wp:cNvGraphicFramePr>
+              <a:graphicFrameLocks xmlns:a="http://schemas.openxmlformats.org/drawingml/2006/main" noChangeAspect="1"/>
+            </wp:cNvGraphicFramePr>
+            <a:graphic xmlns:a="http://schemas.openxmlformats.org/drawingml/2006/main">
+              <a:graphicData uri="http://schemas.openxmlformats.org/drawingml/2006/picture">
+                <pic:pic xmlns:pic="http://schemas.openxmlformats.org/drawingml/2006/picture">
+                  <pic:nvPicPr>
+                    <pic:cNvPr id="1780905106" name="Picture 1" descr="A screenshot of a computer&#10;&#10;AI-generated content may be incorrect."/>
+                    <pic:cNvPicPr/>
+                  </pic:nvPicPr>
+                  <pic:blipFill>
+                    <a:blip r:embed="rId10">
+                      <a:extLst>
+                        <a:ext uri="{28A0092B-C50C-407E-A947-70E740481C1C}">
+                          <a14:useLocalDpi xmlns:a14="http://schemas.microsoft.com/office/drawing/2010/main" val="0"/>
+                        </a:ext>
+                      </a:extLst>
+                    </a:blip>
+                    <a:stretch>
+                      <a:fillRect/>
+                    </a:stretch>
+                  </pic:blipFill>
+                  <pic:spPr>
+                    <a:xfrm>
+                      <a:off x="0" y="0"/>
+                      <a:ext cx="4304665" cy="3020695"/>
+                    </a:xfrm>
+                    <a:prstGeom prst="rect">
+                      <a:avLst/>
+                    </a:prstGeom>
+                  </pic:spPr>
+                </pic:pic>
+              </a:graphicData>
+            </a:graphic>
+            <wp14:sizeRelH relativeFrom="margin">
+              <wp14:pctWidth>0</wp14:pctWidth>
+            </wp14:sizeRelH>
+            <wp14:sizeRelV relativeFrom="margin">
+              <wp14:pctHeight>0</wp14:pctHeight>
+            </wp14:sizeRelV>
+          </wp:anchor>
+        </w:drawing>
+      </w:r>
+    </w:p>
+    <w:p/>
+    <w:p/>
+    <w:p>
+      <w:r>
+        <w:rPr>
+          <w:noProof/>
+        </w:rPr>
+        <w:lastRenderedPageBreak/>
+        <mc:AlternateContent>
+          <mc:Choice Requires="wps">
+            <w:drawing>
+              <wp:anchor distT="0" distB="0" distL="114300" distR="114300" simplePos="0" relativeHeight="251708416" behindDoc="0" locked="0" layoutInCell="1" allowOverlap="1" wp14:anchorId="1E9EE75C" wp14:editId="140D92D9">
+                <wp:simplePos x="0" y="0"/>
+                <wp:positionH relativeFrom="column">
+                  <wp:posOffset>6985</wp:posOffset>
+                </wp:positionH>
+                <wp:positionV relativeFrom="paragraph">
+                  <wp:posOffset>1564005</wp:posOffset>
+                </wp:positionV>
+                <wp:extent cx="5182870" cy="635"/>
+                <wp:effectExtent l="0" t="0" r="0" b="0"/>
+                <wp:wrapTopAndBottom/>
+                <wp:docPr id="2110479291" name="Text Box 1"/>
+                <wp:cNvGraphicFramePr/>
+                <a:graphic xmlns:a="http://schemas.openxmlformats.org/drawingml/2006/main">
+                  <a:graphicData uri="http://schemas.microsoft.com/office/word/2010/wordprocessingShape">
+                    <wps:wsp>
+                      <wps:cNvSpPr txBox="1"/>
+                      <wps:spPr>
+                        <a:xfrm>
+                          <a:off x="0" y="0"/>
+                          <a:ext cx="5182870" cy="635"/>
+                        </a:xfrm>
+                        <a:prstGeom prst="rect">
+                          <a:avLst/>
+                        </a:prstGeom>
+                        <a:solidFill>
+                          <a:prstClr val="white"/>
+                        </a:solidFill>
+                        <a:ln>
+                          <a:noFill/>
+                        </a:ln>
+                      </wps:spPr>
+                      <wps:txbx>
+                        <w:txbxContent>
+                          <w:p>
+                            <w:pPr>
+                              <w:pStyle w:val="Caption"/>
+                            </w:pPr>
+                            <w:r>
+                              <w:t xml:space="preserve">Abbildung </w:t>
+                            </w:r>
+                            <w:r>
+                              <w:fldChar w:fldCharType="begin"/>
+                            </w:r>
+                            <w:r>
+                              <w:instrText xml:space="preserve"> SEQ Abbildung \* ARABIC </w:instrText>
+                            </w:r>
+                            <w:r>
+                              <w:fldChar w:fldCharType="separate"/>
+                            </w:r>
+                            <w:r>
+                              <w:rPr>
+                                <w:noProof/>
+                              </w:rPr>
+                              <w:t>4</w:t>
+                            </w:r>
+                            <w:r>
+                              <w:fldChar w:fldCharType="end"/>
+                            </w:r>
+                            <w:r>
+                              <w:t>: Tracks</w:t>
+                            </w:r>
+                          </w:p>
+                        </w:txbxContent>
+                      </wps:txbx>
+                      <wps:bodyPr rot="0" spcFirstLastPara="0" vertOverflow="overflow" horzOverflow="overflow" vert="horz" wrap="square" lIns="0" tIns="0" rIns="0" bIns="0" numCol="1" spcCol="0" rtlCol="0" fromWordArt="0" anchor="t" anchorCtr="0" forceAA="0" compatLnSpc="1">
+                        <a:prstTxWarp prst="textNoShape">
+                          <a:avLst/>
+                        </a:prstTxWarp>
+                        <a:spAutoFit/>
+                      </wps:bodyPr>
+                    </wps:wsp>
+                  </a:graphicData>
+                </a:graphic>
+              </wp:anchor>
+            </w:drawing>
+          </mc:Choice>
+          <mc:Fallback>
+            <w:pict>
+              <v:shape w14:anchorId="1E9EE75C" id="_x0000_s1033" type="#_x0000_t202" style="position:absolute;left:0;text-align:left;margin-left:.55pt;margin-top:123.15pt;width:408.1pt;height:.05pt;z-index:251708416;visibility:visible;mso-wrap-style:square;mso-wrap-distance-left:9pt;mso-wrap-distance-top:0;mso-wrap-distance-right:9pt;mso-wrap-distance-bottom:0;mso-position-horizontal:absolute;mso-position-horizontal-relative:text;mso-position-vertical:absolute;mso-position-vertical-relative:text;v-text-anchor:top" o:gfxdata="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" stroked="f">
+                <v:textbox style="mso-fit-shape-to-text:t" inset="0,0,0,0">
+                  <w:txbxContent>
+                    <w:p>
+                      <w:pPr>
+                        <w:pStyle w:val="Caption"/>
+                      </w:pPr>
+                      <w:r>
+                        <w:t xml:space="preserve">Abbildung </w:t>
+                      </w:r>
+                      <w:r>
+                        <w:fldChar w:fldCharType="begin"/>
+                      </w:r>
+                      <w:r>
+                        <w:instrText xml:space="preserve"> SEQ Abbildung \* ARABIC </w:instrText>
+                      </w:r>
+                      <w:r>
+                        <w:fldChar w:fldCharType="separate"/>
+                      </w:r>
+                      <w:r>
+                        <w:rPr>
+                          <w:noProof/>
+                        </w:rPr>
+                        <w:t>4</w:t>
+                      </w:r>
+                      <w:r>
+                        <w:fldChar w:fldCharType="end"/>
+                      </w:r>
+                      <w:r>
+                        <w:t>: Tracks</w:t>
+                      </w:r>
+                    </w:p>
+                  </w:txbxContent>
+                </v:textbox>
+                <w10:wrap type="topAndBottom"/>
+              </v:shape>
+            </w:pict>
+          </mc:Fallback>
+        </mc:AlternateContent>
+      </w:r>
+      <w:r>
+        <w:drawing>
+          <wp:anchor distT="0" distB="0" distL="114300" distR="114300" simplePos="0" relativeHeight="251706368" behindDoc="0" locked="0" layoutInCell="1" allowOverlap="1" wp14:anchorId="794456D3" wp14:editId="717A8612">
+            <wp:simplePos x="0" y="0"/>
+            <wp:positionH relativeFrom="column">
+              <wp:posOffset>6985</wp:posOffset>
+            </wp:positionH>
+            <wp:positionV relativeFrom="paragraph">
+              <wp:posOffset>265234</wp:posOffset>
+            </wp:positionV>
+            <wp:extent cx="5182870" cy="1228090"/>
+            <wp:effectExtent l="0" t="0" r="0" b="0"/>
+            <wp:wrapTopAndBottom/>
+            <wp:docPr id="87037609" name="Picture 1" descr="A screenshot of a computer&#10;&#10;AI-generated content may be incorrect."/>
+            <wp:cNvGraphicFramePr>
+              <a:graphicFrameLocks xmlns:a="http://schemas.openxmlformats.org/drawingml/2006/main" noChangeAspect="1"/>
+            </wp:cNvGraphicFramePr>
+            <a:graphic xmlns:a="http://schemas.openxmlformats.org/drawingml/2006/main">
+              <a:graphicData uri="http://schemas.openxmlformats.org/drawingml/2006/picture">
+                <pic:pic xmlns:pic="http://schemas.openxmlformats.org/drawingml/2006/picture">
+                  <pic:nvPicPr>
+                    <pic:cNvPr id="87037609" name="Picture 1" descr="A screenshot of a computer&#10;&#10;AI-generated content may be incorrect."/>
+                    <pic:cNvPicPr/>
+                  </pic:nvPicPr>
+                  <pic:blipFill>
+                    <a:blip r:embed="rId11" cstate="print">
+                      <a:extLst>
+                        <a:ext uri="{28A0092B-C50C-407E-A947-70E740481C1C}">
+                          <a14:useLocalDpi xmlns:a14="http://schemas.microsoft.com/office/drawing/2010/main" val="0"/>
+                        </a:ext>
+                      </a:extLst>
+                    </a:blip>
+                    <a:stretch>
+                      <a:fillRect/>
+                    </a:stretch>
+                  </pic:blipFill>
+                  <pic:spPr>
+                    <a:xfrm>
+                      <a:off x="0" y="0"/>
+                      <a:ext cx="5182870" cy="1228090"/>
+                    </a:xfrm>
+                    <a:prstGeom prst="rect">
+                      <a:avLst/>
+                    </a:prstGeom>
+                  </pic:spPr>
+                </pic:pic>
+              </a:graphicData>
+            </a:graphic>
+          </wp:anchor>
+        </w:drawing>
+      </w:r>
+    </w:p>
+    <w:p>
+      <w:r>
+        <w:t>Die Sprachaufnahme ist gut wahrnehmbar.</w:t>
+      </w:r>
+    </w:p>
+    <w:p/>
+    <w:p>
+      <w:pPr>
+        <w:jc w:val="left"/>
+      </w:pPr>
+      <w:r>
+        <w:br w:type="page"/>
+      </w:r>
+    </w:p>
+    <w:p>
+      <w:pPr>
+        <w:pStyle w:val="Heading1"/>
+      </w:pPr>
+      <w:r>
+        <w:lastRenderedPageBreak/>
+        <w:t>AUFGABE 2 Quantisierung, Dithering</w:t>
+      </w:r>
+    </w:p>
+    <w:p>
+      <w:r>
+        <w:rPr>
+          <w:noProof/>
+        </w:rPr>
+        <mc:AlternateContent>
+          <mc:Choice Requires="wps">
+            <w:drawing>
+              <wp:anchor distT="0" distB="0" distL="114300" distR="114300" simplePos="0" relativeHeight="251711488" behindDoc="0" locked="0" layoutInCell="1" allowOverlap="1" wp14:anchorId="3D5C44DE" wp14:editId="72DD04F1">
+                <wp:simplePos x="0" y="0"/>
+                <wp:positionH relativeFrom="column">
+                  <wp:posOffset>2038985</wp:posOffset>
+                </wp:positionH>
+                <wp:positionV relativeFrom="paragraph">
+                  <wp:posOffset>3375660</wp:posOffset>
+                </wp:positionV>
+                <wp:extent cx="1095375" cy="635"/>
+                <wp:effectExtent l="0" t="0" r="0" b="0"/>
+                <wp:wrapTopAndBottom/>
+                <wp:docPr id="634492082" name="Text Box 1"/>
+                <wp:cNvGraphicFramePr/>
+                <a:graphic xmlns:a="http://schemas.openxmlformats.org/drawingml/2006/main">
+                  <a:graphicData uri="http://schemas.microsoft.com/office/word/2010/wordprocessingShape">
+                    <wps:wsp>
+                      <wps:cNvSpPr txBox="1"/>
+                      <wps:spPr>
+                        <a:xfrm>
+                          <a:off x="0" y="0"/>
+                          <a:ext cx="1095375" cy="635"/>
+                        </a:xfrm>
+                        <a:prstGeom prst="rect">
+                          <a:avLst/>
+                        </a:prstGeom>
+                        <a:solidFill>
+                          <a:prstClr val="white"/>
+                        </a:solidFill>
+                        <a:ln>
+                          <a:noFill/>
+                        </a:ln>
+                      </wps:spPr>
+                      <wps:txbx>
+                        <w:txbxContent>
+                          <w:p>
+                            <w:pPr>
+                              <w:pStyle w:val="Caption"/>
+                            </w:pPr>
+                            <w:r>
+                              <w:t xml:space="preserve">Abbildung </w:t>
+                            </w:r>
+                            <w:r>
+                              <w:fldChar w:fldCharType="begin"/>
+                            </w:r>
+                            <w:r>
+                              <w:instrText xml:space="preserve"> SEQ Abbildung \* ARABIC </w:instrText>
+                            </w:r>
+                            <w:r>
+                              <w:fldChar w:fldCharType="separate"/>
+                            </w:r>
+                            <w:r>
+                              <w:rPr>
+                                <w:noProof/>
+                              </w:rPr>
+                              <w:t>5</w:t>
+                            </w:r>
+                            <w:r>
+                              <w:fldChar w:fldCharType="end"/>
+                            </w:r>
+                            <w:r>
+                              <w:t>: Bit Reduction / Dither aktiviert</w:t>
+                            </w:r>
+                          </w:p>
+                        </w:txbxContent>
+                      </wps:txbx>
+                      <wps:bodyPr rot="0" spcFirstLastPara="0" vertOverflow="overflow" horzOverflow="overflow" vert="horz" wrap="square" lIns="0" tIns="0" rIns="0" bIns="0" numCol="1" spcCol="0" rtlCol="0" fromWordArt="0" anchor="t" anchorCtr="0" forceAA="0" compatLnSpc="1">
+                        <a:prstTxWarp prst="textNoShape">
+                          <a:avLst/>
+                        </a:prstTxWarp>
+                        <a:spAutoFit/>
+                      </wps:bodyPr>
+                    </wps:wsp>
+                  </a:graphicData>
+                </a:graphic>
+              </wp:anchor>
+            </w:drawing>
+          </mc:Choice>
+          <mc:Fallback>
+            <w:pict>
+              <v:shape w14:anchorId="3D5C44DE" id="_x0000_s1034" type="#_x0000_t202" style="position:absolute;left:0;text-align:left;margin-left:160.55pt;margin-top:265.8pt;width:86.25pt;height:.05pt;z-index:251711488;visibility:visible;mso-wrap-style:square;mso-wrap-distance-left:9pt;mso-wrap-distance-top:0;mso-wrap-distance-right:9pt;mso-wrap-distance-bottom:0;mso-position-horizontal:absolute;mso-position-horizontal-relative:text;mso-position-vertical:absolute;mso-position-vertical-relative:text;v-text-anchor:top" o:gfxdata="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" stroked="f">
+                <v:textbox style="mso-fit-shape-to-text:t" inset="0,0,0,0">
+                  <w:txbxContent>
+                    <w:p>
+                      <w:pPr>
+                        <w:pStyle w:val="Caption"/>
+                      </w:pPr>
+                      <w:r>
+                        <w:t xml:space="preserve">Abbildung </w:t>
+                      </w:r>
+                      <w:r>
+                        <w:fldChar w:fldCharType="begin"/>
+                      </w:r>
+                      <w:r>
+                        <w:instrText xml:space="preserve"> SEQ Abbildung \* ARABIC </w:instrText>
+                      </w:r>
+                      <w:r>
+                        <w:fldChar w:fldCharType="separate"/>
+                      </w:r>
+                      <w:r>
+                        <w:rPr>
+                          <w:noProof/>
+                        </w:rPr>
+                        <w:t>5</w:t>
+                      </w:r>
+                      <w:r>
+                        <w:fldChar w:fldCharType="end"/>
+                      </w:r>
+                      <w:r>
+                        <w:t>: Bit Reduction / Dither aktiviert</w:t>
+                      </w:r>
+                    </w:p>
+                  </w:txbxContent>
+                </v:textbox>
+                <w10:wrap type="topAndBottom"/>
+              </v:shape>
+            </w:pict>
+          </mc:Fallback>
+        </mc:AlternateContent>
+      </w:r>
+      <w:r>
+        <w:drawing>
+          <wp:anchor distT="0" distB="0" distL="114300" distR="114300" simplePos="0" relativeHeight="251709440" behindDoc="0" locked="0" layoutInCell="1" allowOverlap="1" wp14:anchorId="55AE4687" wp14:editId="30A80392">
+            <wp:simplePos x="0" y="0"/>
+            <wp:positionH relativeFrom="margin">
+              <wp:align>center</wp:align>
+            </wp:positionH>
+            <wp:positionV relativeFrom="paragraph">
+              <wp:posOffset>499648</wp:posOffset>
+            </wp:positionV>
+            <wp:extent cx="1095528" cy="2819794"/>
+            <wp:effectExtent l="0" t="0" r="9525" b="0"/>
+            <wp:wrapTopAndBottom/>
+            <wp:docPr id="1204440254" name="Picture 1" descr="A screenshot of a music player&#10;&#10;AI-generated content may be incorrect."/>
+            <wp:cNvGraphicFramePr>
+              <a:graphicFrameLocks xmlns:a="http://schemas.openxmlformats.org/drawingml/2006/main" noChangeAspect="1"/>
+            </wp:cNvGraphicFramePr>
+            <a:graphic xmlns:a="http://schemas.openxmlformats.org/drawingml/2006/main">
+              <a:graphicData uri="http://schemas.openxmlformats.org/drawingml/2006/picture">
+                <pic:pic xmlns:pic="http://schemas.openxmlformats.org/drawingml/2006/picture">
+                  <pic:nvPicPr>
+                    <pic:cNvPr id="1204440254" name="Picture 1" descr="A screenshot of a music player&#10;&#10;AI-generated content may be incorrect."/>
+                    <pic:cNvPicPr/>
+                  </pic:nvPicPr>
+                  <pic:blipFill>
+                    <a:blip r:embed="rId12">
+                      <a:extLst>
+                        <a:ext uri="{28A0092B-C50C-407E-A947-70E740481C1C}">
+                          <a14:useLocalDpi xmlns:a14="http://schemas.microsoft.com/office/drawing/2010/main" val="0"/>
+                        </a:ext>
+                      </a:extLst>
+                    </a:blip>
+                    <a:stretch>
+                      <a:fillRect/>
+                    </a:stretch>
+                  </pic:blipFill>
+                  <pic:spPr>
+                    <a:xfrm>
+                      <a:off x="0" y="0"/>
+                      <a:ext cx="1095528" cy="2819794"/>
+                    </a:xfrm>
+                    <a:prstGeom prst="rect">
+                      <a:avLst/>
+                    </a:prstGeom>
+                  </pic:spPr>
+                </pic:pic>
+              </a:graphicData>
+            </a:graphic>
+          </wp:anchor>
+        </w:drawing>
+      </w:r>
+    </w:p>
+    <w:p>
+      <w:pPr>
+        <w:pStyle w:val="Quote"/>
+      </w:pPr>
+      <w:r>
+        <w:t>Welchen peak Wert sehen Sie nun und warum?</w:t>
+      </w:r>
+    </w:p>
+    <w:p>
+      <w:r>
+        <w:t xml:space="preserve">Es wird nun ein Peak Wert von -90 LUFS </w:t>
+      </w:r>
+      <w:r>
+        <w:t>angezeigt</w:t>
+      </w:r>
+      <w:r>
+        <w:t xml:space="preserve">. Die Bit-Tiefe wird von 24 Bit auf 16 Bit reduziert. </w:t>
+      </w:r>
+      <w:r>
+        <w:t>Der Bit-Reduktion FX fügt ein Rauschen hinzu, damit die Bits zufällig verteilt sind.</w:t>
+      </w:r>
+      <w:r>
         <w:t xml:space="preserve"> </w:t>
+      </w:r>
+    </w:p>
+    <w:p>
+      <w:pPr>
+        <w:pStyle w:val="Quote"/>
+      </w:pPr>
+      <w:r>
+        <w:t>Verringern Sie die Bittiefe im Effekt. Ab wann können Sie ein Rauschen wahrnehmen?</w:t>
+      </w:r>
+    </w:p>
+    <w:p>
+      <w:r>
+        <w:t xml:space="preserve">Ab 10 Bits ist ein Rauschen wahrnehmbar. </w:t>
+      </w:r>
+    </w:p>
+    <w:p>
+      <w:pPr>
+        <w:pStyle w:val="Quote"/>
+      </w:pPr>
+      <w:r>
+        <w:t>Woher kommt es?</w:t>
+      </w:r>
+    </w:p>
+    <w:p>
+      <w:r>
+        <w:t>Der Effekt erzeigt das Rauschen, da bei reduziert Bit-Tiefe weniger mögliche Zustände existieren, ist es immer mehr wahrnehmbar.</w:t>
+      </w:r>
+    </w:p>
+    <w:p>
+      <w:pPr>
+        <w:jc w:val="left"/>
+      </w:pPr>
+      <w:r>
+        <w:br w:type="page"/>
+      </w:r>
+    </w:p>
+    <w:p>
+      <w:pPr>
+        <w:pStyle w:val="Heading1"/>
+      </w:pPr>
+      <w:r>
+        <w:lastRenderedPageBreak/>
+        <w:t>AUFGABE 3 Pegel, Datenrate</w:t>
+      </w:r>
+    </w:p>
+    <w:p>
+      <w:pPr>
+        <w:pStyle w:val="Quote"/>
+      </w:pPr>
+      <w:r>
+        <w:t>3.1 Bringen Sie die Aufnahme durch Limitierung am Master auf R128 Norm (kann bei der nächsten Aufgabe überprüft werden).</w:t>
+      </w:r>
+    </w:p>
+    <w:p>
+      <w:r>
+        <w:rPr>
+          <w:noProof/>
+        </w:rPr>
+        <mc:AlternateContent>
+          <mc:Choice Requires="wps">
+            <w:drawing>
+              <wp:anchor distT="0" distB="0" distL="114300" distR="114300" simplePos="0" relativeHeight="251714560" behindDoc="0" locked="0" layoutInCell="1" allowOverlap="1" wp14:anchorId="68A60453" wp14:editId="799D3D99">
+                <wp:simplePos x="0" y="0"/>
+                <wp:positionH relativeFrom="column">
+                  <wp:posOffset>146050</wp:posOffset>
+                </wp:positionH>
+                <wp:positionV relativeFrom="paragraph">
+                  <wp:posOffset>4025900</wp:posOffset>
+                </wp:positionV>
+                <wp:extent cx="5182870" cy="635"/>
+                <wp:effectExtent l="0" t="0" r="0" b="0"/>
+                <wp:wrapTopAndBottom/>
+                <wp:docPr id="372240886" name="Text Box 1"/>
+                <wp:cNvGraphicFramePr/>
+                <a:graphic xmlns:a="http://schemas.openxmlformats.org/drawingml/2006/main">
+                  <a:graphicData uri="http://schemas.microsoft.com/office/word/2010/wordprocessingShape">
+                    <wps:wsp>
+                      <wps:cNvSpPr txBox="1"/>
+                      <wps:spPr>
+                        <a:xfrm>
+                          <a:off x="0" y="0"/>
+                          <a:ext cx="5182870" cy="635"/>
+                        </a:xfrm>
+                        <a:prstGeom prst="rect">
+                          <a:avLst/>
+                        </a:prstGeom>
+                        <a:solidFill>
+                          <a:prstClr val="white"/>
+                        </a:solidFill>
+                        <a:ln>
+                          <a:noFill/>
+                        </a:ln>
+                      </wps:spPr>
+                      <wps:txbx>
+                        <w:txbxContent>
+                          <w:p>
+                            <w:pPr>
+                              <w:pStyle w:val="Caption"/>
+                            </w:pPr>
+                            <w:r>
+                              <w:t xml:space="preserve">Abbildung </w:t>
+                            </w:r>
+                            <w:r>
+                              <w:fldChar w:fldCharType="begin"/>
+                            </w:r>
+                            <w:r>
+                              <w:instrText xml:space="preserve"> SEQ Abbildung \* ARABIC </w:instrText>
+                            </w:r>
+                            <w:r>
+                              <w:fldChar w:fldCharType="separate"/>
+                            </w:r>
+                            <w:r>
+                              <w:rPr>
+                                <w:noProof/>
+                              </w:rPr>
+                              <w:t>6</w:t>
+                            </w:r>
+                            <w:r>
+                              <w:fldChar w:fldCharType="end"/>
+                            </w:r>
+                            <w:r>
+                              <w:t>: -23 LUFS</w:t>
+                            </w:r>
+                          </w:p>
+                        </w:txbxContent>
+                      </wps:txbx>
+                      <wps:bodyPr rot="0" spcFirstLastPara="0" vertOverflow="overflow" horzOverflow="overflow" vert="horz" wrap="square" lIns="0" tIns="0" rIns="0" bIns="0" numCol="1" spcCol="0" rtlCol="0" fromWordArt="0" anchor="t" anchorCtr="0" forceAA="0" compatLnSpc="1">
+                        <a:prstTxWarp prst="textNoShape">
+                          <a:avLst/>
+                        </a:prstTxWarp>
+                        <a:spAutoFit/>
+                      </wps:bodyPr>
+                    </wps:wsp>
+                  </a:graphicData>
+                </a:graphic>
+              </wp:anchor>
+            </w:drawing>
+          </mc:Choice>
+          <mc:Fallback>
+            <w:pict>
+              <v:shape w14:anchorId="68A60453" id="_x0000_s1035" type="#_x0000_t202" style="position:absolute;left:0;text-align:left;margin-left:11.5pt;margin-top:317pt;width:408.1pt;height:.05pt;z-index:251714560;visibility:visible;mso-wrap-style:square;mso-wrap-distance-left:9pt;mso-wrap-distance-top:0;mso-wrap-distance-right:9pt;mso-wrap-distance-bottom:0;mso-position-horizontal:absolute;mso-position-horizontal-relative:text;mso-position-vertical:absolute;mso-position-vertical-relative:text;v-text-anchor:top" o:gfxdata="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" stroked="f">
+                <v:textbox style="mso-fit-shape-to-text:t" inset="0,0,0,0">
+                  <w:txbxContent>
+                    <w:p>
+                      <w:pPr>
+                        <w:pStyle w:val="Caption"/>
+                      </w:pPr>
+                      <w:r>
+                        <w:t xml:space="preserve">Abbildung </w:t>
+                      </w:r>
+                      <w:r>
+                        <w:fldChar w:fldCharType="begin"/>
+                      </w:r>
+                      <w:r>
+                        <w:instrText xml:space="preserve"> SEQ Abbildung \* ARABIC </w:instrText>
+                      </w:r>
+                      <w:r>
+                        <w:fldChar w:fldCharType="separate"/>
+                      </w:r>
+                      <w:r>
+                        <w:rPr>
+                          <w:noProof/>
+                        </w:rPr>
+                        <w:t>6</w:t>
+                      </w:r>
+                      <w:r>
+                        <w:fldChar w:fldCharType="end"/>
+                      </w:r>
+                      <w:r>
+                        <w:t>: -23 LUFS</w:t>
+                      </w:r>
+                    </w:p>
+                  </w:txbxContent>
+                </v:textbox>
+                <w10:wrap type="topAndBottom"/>
+              </v:shape>
+            </w:pict>
+          </mc:Fallback>
+        </mc:AlternateContent>
+      </w:r>
+      <w:r>
+        <w:drawing>
+          <wp:anchor distT="0" distB="0" distL="114300" distR="114300" simplePos="0" relativeHeight="251712512" behindDoc="1" locked="0" layoutInCell="1" allowOverlap="1" wp14:anchorId="435FCA5E" wp14:editId="18E739B3">
+            <wp:simplePos x="0" y="0"/>
+            <wp:positionH relativeFrom="column">
+              <wp:posOffset>146120</wp:posOffset>
+            </wp:positionH>
+            <wp:positionV relativeFrom="paragraph">
+              <wp:posOffset>241318</wp:posOffset>
+            </wp:positionV>
+            <wp:extent cx="5182870" cy="3727450"/>
+            <wp:effectExtent l="0" t="0" r="0" b="6350"/>
+            <wp:wrapTopAndBottom/>
+            <wp:docPr id="1346880709" name="Picture 1" descr="A screen shot of a computer&#10;&#10;AI-generated content may be incorrect."/>
+            <wp:cNvGraphicFramePr>
+              <a:graphicFrameLocks xmlns:a="http://schemas.openxmlformats.org/drawingml/2006/main" noChangeAspect="1"/>
+            </wp:cNvGraphicFramePr>
+            <a:graphic xmlns:a="http://schemas.openxmlformats.org/drawingml/2006/main">
+              <a:graphicData uri="http://schemas.openxmlformats.org/drawingml/2006/picture">
+                <pic:pic xmlns:pic="http://schemas.openxmlformats.org/drawingml/2006/picture">
+                  <pic:nvPicPr>
+                    <pic:cNvPr id="1346880709" name="Picture 1" descr="A screen shot of a computer&#10;&#10;AI-generated content may be incorrect."/>
+                    <pic:cNvPicPr/>
+                  </pic:nvPicPr>
+                  <pic:blipFill>
+                    <a:blip r:embed="rId13">
+                      <a:extLst>
+                        <a:ext uri="{28A0092B-C50C-407E-A947-70E740481C1C}">
+                          <a14:useLocalDpi xmlns:a14="http://schemas.microsoft.com/office/drawing/2010/main" val="0"/>
+                        </a:ext>
+                      </a:extLst>
+                    </a:blip>
+                    <a:stretch>
+                      <a:fillRect/>
+                    </a:stretch>
+                  </pic:blipFill>
+                  <pic:spPr>
+                    <a:xfrm>
+                      <a:off x="0" y="0"/>
+                      <a:ext cx="5182870" cy="3727450"/>
+                    </a:xfrm>
+                    <a:prstGeom prst="rect">
+                      <a:avLst/>
+                    </a:prstGeom>
+                  </pic:spPr>
+                </pic:pic>
+              </a:graphicData>
+            </a:graphic>
+          </wp:anchor>
+        </w:drawing>
+      </w:r>
+    </w:p>
+    <w:p/>
+    <w:p>
+      <w:pPr>
+        <w:pStyle w:val="Quote"/>
+      </w:pPr>
+      <w:r>
+        <w:t>3.2 Die Aufnahme einmal in CD Qualität inkl Dithering und als mp3 in unterschiedlichen Bitraten rendern (PCM uncompressed, 128, 80 &amp; 40kbps) und 1x dabei eine Analysedatei erstellen (Save outfile.render_stats.html checkbox im Render Window)</w:t>
+      </w:r>
+    </w:p>
+    <w:p>
+      <w:r>
+        <w:rPr>
+          <w:noProof/>
+        </w:rPr>
+        <mc:AlternateContent>
+          <mc:Choice Requires="wps">
+            <w:drawing>
+              <wp:anchor distT="0" distB="0" distL="114300" distR="114300" simplePos="0" relativeHeight="251717632" behindDoc="0" locked="0" layoutInCell="1" allowOverlap="1" wp14:anchorId="6F42D110" wp14:editId="6C75519B">
+                <wp:simplePos x="0" y="0"/>
+                <wp:positionH relativeFrom="column">
+                  <wp:posOffset>125730</wp:posOffset>
+                </wp:positionH>
+                <wp:positionV relativeFrom="paragraph">
+                  <wp:posOffset>1292860</wp:posOffset>
+                </wp:positionV>
+                <wp:extent cx="5182870" cy="635"/>
+                <wp:effectExtent l="0" t="0" r="0" b="0"/>
+                <wp:wrapTopAndBottom/>
+                <wp:docPr id="1473518334" name="Text Box 1"/>
+                <wp:cNvGraphicFramePr/>
+                <a:graphic xmlns:a="http://schemas.openxmlformats.org/drawingml/2006/main">
+                  <a:graphicData uri="http://schemas.microsoft.com/office/word/2010/wordprocessingShape">
+                    <wps:wsp>
+                      <wps:cNvSpPr txBox="1"/>
+                      <wps:spPr>
+                        <a:xfrm>
+                          <a:off x="0" y="0"/>
+                          <a:ext cx="5182870" cy="635"/>
+                        </a:xfrm>
+                        <a:prstGeom prst="rect">
+                          <a:avLst/>
+                        </a:prstGeom>
+                        <a:solidFill>
+                          <a:prstClr val="white"/>
+                        </a:solidFill>
+                        <a:ln>
+                          <a:noFill/>
+                        </a:ln>
+                      </wps:spPr>
+                      <wps:txbx>
+                        <w:txbxContent>
+                          <w:p>
+                            <w:pPr>
+                              <w:pStyle w:val="Caption"/>
+                            </w:pPr>
+                            <w:r>
+                              <w:t xml:space="preserve">Abbildung </w:t>
+                            </w:r>
+                            <w:r>
+                              <w:fldChar w:fldCharType="begin"/>
+                            </w:r>
+                            <w:r>
+                              <w:instrText xml:space="preserve"> SEQ Abbildung \* ARABIC </w:instrText>
+                            </w:r>
+                            <w:r>
+                              <w:fldChar w:fldCharType="separate"/>
+                            </w:r>
+                            <w:r>
+                              <w:rPr>
+                                <w:noProof/>
+                              </w:rPr>
+                              <w:t>7</w:t>
+                            </w:r>
+                            <w:r>
+                              <w:fldChar w:fldCharType="end"/>
+                            </w:r>
+                            <w:r>
+                              <w:t>: Render</w:t>
+                            </w:r>
+                          </w:p>
+                        </w:txbxContent>
+                      </wps:txbx>
+                      <wps:bodyPr rot="0" spcFirstLastPara="0" vertOverflow="overflow" horzOverflow="overflow" vert="horz" wrap="square" lIns="0" tIns="0" rIns="0" bIns="0" numCol="1" spcCol="0" rtlCol="0" fromWordArt="0" anchor="t" anchorCtr="0" forceAA="0" compatLnSpc="1">
+                        <a:prstTxWarp prst="textNoShape">
+                          <a:avLst/>
+                        </a:prstTxWarp>
+                        <a:spAutoFit/>
+                      </wps:bodyPr>
+                    </wps:wsp>
+                  </a:graphicData>
+                </a:graphic>
+              </wp:anchor>
+            </w:drawing>
+          </mc:Choice>
+          <mc:Fallback>
+            <w:pict>
+              <v:shape w14:anchorId="6F42D110" id="_x0000_s1036" type="#_x0000_t202" style="position:absolute;left:0;text-align:left;margin-left:9.9pt;margin-top:101.8pt;width:408.1pt;height:.05pt;z-index:251717632;visibility:visible;mso-wrap-style:square;mso-wrap-distance-left:9pt;mso-wrap-distance-top:0;mso-wrap-distance-right:9pt;mso-wrap-distance-bottom:0;mso-position-horizontal:absolute;mso-position-horizontal-relative:text;mso-position-vertical:absolute;mso-position-vertical-relative:text;v-text-anchor:top" o:gfxdata="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" stroked="f">
+                <v:textbox style="mso-fit-shape-to-text:t" inset="0,0,0,0">
+                  <w:txbxContent>
+                    <w:p>
+                      <w:pPr>
+                        <w:pStyle w:val="Caption"/>
+                      </w:pPr>
+                      <w:r>
+                        <w:t xml:space="preserve">Abbildung </w:t>
+                      </w:r>
+                      <w:r>
+                        <w:fldChar w:fldCharType="begin"/>
+                      </w:r>
+                      <w:r>
+                        <w:instrText xml:space="preserve"> SEQ Abbildung \* ARABIC </w:instrText>
+                      </w:r>
+                      <w:r>
+                        <w:fldChar w:fldCharType="separate"/>
+                      </w:r>
+                      <w:r>
+                        <w:rPr>
+                          <w:noProof/>
+                        </w:rPr>
+                        <w:t>7</w:t>
+                      </w:r>
+                      <w:r>
+                        <w:fldChar w:fldCharType="end"/>
+                      </w:r>
+                      <w:r>
+                        <w:t>: Render</w:t>
+                      </w:r>
+                    </w:p>
+                  </w:txbxContent>
+                </v:textbox>
+                <w10:wrap type="topAndBottom"/>
+              </v:shape>
+            </w:pict>
+          </mc:Fallback>
+        </mc:AlternateContent>
+      </w:r>
+      <w:r>
+        <w:drawing>
+          <wp:anchor distT="0" distB="0" distL="114300" distR="114300" simplePos="0" relativeHeight="251715584" behindDoc="0" locked="0" layoutInCell="1" allowOverlap="1" wp14:anchorId="5DA9C52E" wp14:editId="352F510C">
+            <wp:simplePos x="0" y="0"/>
+            <wp:positionH relativeFrom="margin">
+              <wp:posOffset>126337</wp:posOffset>
+            </wp:positionH>
+            <wp:positionV relativeFrom="paragraph">
+              <wp:posOffset>219599</wp:posOffset>
+            </wp:positionV>
+            <wp:extent cx="5182870" cy="1016635"/>
+            <wp:effectExtent l="0" t="0" r="0" b="0"/>
+            <wp:wrapTopAndBottom/>
+            <wp:docPr id="2071306609" name="Picture 1" descr="A screenshot of a computer screen&#10;&#10;AI-generated content may be incorrect."/>
+            <wp:cNvGraphicFramePr>
+              <a:graphicFrameLocks xmlns:a="http://schemas.openxmlformats.org/drawingml/2006/main" noChangeAspect="1"/>
+            </wp:cNvGraphicFramePr>
+            <a:graphic xmlns:a="http://schemas.openxmlformats.org/drawingml/2006/main">
+              <a:graphicData uri="http://schemas.openxmlformats.org/drawingml/2006/picture">
+                <pic:pic xmlns:pic="http://schemas.openxmlformats.org/drawingml/2006/picture">
+                  <pic:nvPicPr>
+                    <pic:cNvPr id="2071306609" name="Picture 1" descr="A screenshot of a computer screen&#10;&#10;AI-generated content may be incorrect."/>
+                    <pic:cNvPicPr/>
+                  </pic:nvPicPr>
+                  <pic:blipFill>
+                    <a:blip r:embed="rId14">
+                      <a:extLst>
+                        <a:ext uri="{28A0092B-C50C-407E-A947-70E740481C1C}">
+                          <a14:useLocalDpi xmlns:a14="http://schemas.microsoft.com/office/drawing/2010/main" val="0"/>
+                        </a:ext>
+                      </a:extLst>
+                    </a:blip>
+                    <a:stretch>
+                      <a:fillRect/>
+                    </a:stretch>
+                  </pic:blipFill>
+                  <pic:spPr>
+                    <a:xfrm>
+                      <a:off x="0" y="0"/>
+                      <a:ext cx="5182870" cy="1016635"/>
+                    </a:xfrm>
+                    <a:prstGeom prst="rect">
+                      <a:avLst/>
+                    </a:prstGeom>
+                  </pic:spPr>
+                </pic:pic>
+              </a:graphicData>
+            </a:graphic>
+          </wp:anchor>
+        </w:drawing>
+      </w:r>
+    </w:p>
+    <w:p/>
+    <w:p>
+      <w:pPr>
+        <w:pStyle w:val="Quote"/>
+      </w:pPr>
+      <w:r>
+        <w:lastRenderedPageBreak/>
+        <w:t>Ab welcher Bitrate lässt sich für Sie ein hörbarer Unterschied im Vergleich zum WAV ausmachen? Um ungefähr welchen Faktor verkleinert sich der erforderliche Speicherplatz zwischen wav und mp3 mit 128kbps?</w:t>
+      </w:r>
+    </w:p>
+    <w:p/>
+    <w:p>
+      <w:r>
+        <w:t xml:space="preserve">Ab 40kbps ist ein sehr deutlicher Unterschied. Bei 80 und 128 kbps sind keine großen Unterschiede bemerkbar. </w:t>
+      </w:r>
+    </w:p>
+    <w:p>
+      <w:r>
+        <w:t>Zwischen .wav und .mp3 mit 128kbps ist ein Speicherplatz unterschied von Faktor 10 vorhanden.</w:t>
+      </w:r>
+    </w:p>
+    <w:p>
+      <w:r>
+        <w:rPr>
+          <w:noProof/>
+        </w:rPr>
+        <mc:AlternateContent>
+          <mc:Choice Requires="wps">
+            <w:drawing>
+              <wp:anchor distT="0" distB="0" distL="114300" distR="114300" simplePos="0" relativeHeight="251720704" behindDoc="0" locked="0" layoutInCell="1" allowOverlap="1" wp14:anchorId="26CC707B" wp14:editId="3F41668D">
+                <wp:simplePos x="0" y="0"/>
+                <wp:positionH relativeFrom="column">
+                  <wp:posOffset>313055</wp:posOffset>
+                </wp:positionH>
+                <wp:positionV relativeFrom="paragraph">
+                  <wp:posOffset>3186430</wp:posOffset>
+                </wp:positionV>
+                <wp:extent cx="5182870" cy="635"/>
+                <wp:effectExtent l="0" t="0" r="0" b="0"/>
+                <wp:wrapTopAndBottom/>
+                <wp:docPr id="1382201498" name="Text Box 1"/>
+                <wp:cNvGraphicFramePr/>
+                <a:graphic xmlns:a="http://schemas.openxmlformats.org/drawingml/2006/main">
+                  <a:graphicData uri="http://schemas.microsoft.com/office/word/2010/wordprocessingShape">
+                    <wps:wsp>
+                      <wps:cNvSpPr txBox="1"/>
+                      <wps:spPr>
+                        <a:xfrm>
+                          <a:off x="0" y="0"/>
+                          <a:ext cx="5182870" cy="635"/>
+                        </a:xfrm>
+                        <a:prstGeom prst="rect">
+                          <a:avLst/>
+                        </a:prstGeom>
+                        <a:solidFill>
+                          <a:prstClr val="white"/>
+                        </a:solidFill>
+                        <a:ln>
+                          <a:noFill/>
+                        </a:ln>
+                      </wps:spPr>
+                      <wps:txbx>
+                        <w:txbxContent>
+                          <w:p>
+                            <w:pPr>
+                              <w:pStyle w:val="Caption"/>
+                            </w:pPr>
+                            <w:r>
+                              <w:t xml:space="preserve">Abbildung </w:t>
+                            </w:r>
+                            <w:r>
+                              <w:fldChar w:fldCharType="begin"/>
+                            </w:r>
+                            <w:r>
+                              <w:instrText xml:space="preserve"> SEQ Abbildung \* ARABIC </w:instrText>
+                            </w:r>
+                            <w:r>
+                              <w:fldChar w:fldCharType="separate"/>
+                            </w:r>
+                            <w:r>
+                              <w:rPr>
+                                <w:noProof/>
+                              </w:rPr>
+                              <w:t>8</w:t>
+                            </w:r>
+                            <w:r>
+                              <w:fldChar w:fldCharType="end"/>
+                            </w:r>
+                            <w:r>
+                              <w:t>: Render HTML</w:t>
+                            </w:r>
+                          </w:p>
+                        </w:txbxContent>
+                      </wps:txbx>
+                      <wps:bodyPr rot="0" spcFirstLastPara="0" vertOverflow="overflow" horzOverflow="overflow" vert="horz" wrap="square" lIns="0" tIns="0" rIns="0" bIns="0" numCol="1" spcCol="0" rtlCol="0" fromWordArt="0" anchor="t" anchorCtr="0" forceAA="0" compatLnSpc="1">
+                        <a:prstTxWarp prst="textNoShape">
+                          <a:avLst/>
+                        </a:prstTxWarp>
+                        <a:spAutoFit/>
+                      </wps:bodyPr>
+                    </wps:wsp>
+                  </a:graphicData>
+                </a:graphic>
+              </wp:anchor>
+            </w:drawing>
+          </mc:Choice>
+          <mc:Fallback>
+            <w:pict>
+              <v:shape w14:anchorId="26CC707B" id="_x0000_s1037" type="#_x0000_t202" style="position:absolute;left:0;text-align:left;margin-left:24.65pt;margin-top:250.9pt;width:408.1pt;height:.05pt;z-index:251720704;visibility:visible;mso-wrap-style:square;mso-wrap-distance-left:9pt;mso-wrap-distance-top:0;mso-wrap-distance-right:9pt;mso-wrap-distance-bottom:0;mso-position-horizontal:absolute;mso-position-horizontal-relative:text;mso-position-vertical:absolute;mso-position-vertical-relative:text;v-text-anchor:top" o:gfxdata="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" stroked="f">
+                <v:textbox style="mso-fit-shape-to-text:t" inset="0,0,0,0">
+                  <w:txbxContent>
+                    <w:p>
+                      <w:pPr>
+                        <w:pStyle w:val="Caption"/>
+                      </w:pPr>
+                      <w:r>
+                        <w:t xml:space="preserve">Abbildung </w:t>
+                      </w:r>
+                      <w:r>
+                        <w:fldChar w:fldCharType="begin"/>
+                      </w:r>
+                      <w:r>
+                        <w:instrText xml:space="preserve"> SEQ Abbildung \* ARABIC </w:instrText>
+                      </w:r>
+                      <w:r>
+                        <w:fldChar w:fldCharType="separate"/>
+                      </w:r>
+                      <w:r>
+                        <w:rPr>
+                          <w:noProof/>
+                        </w:rPr>
+                        <w:t>8</w:t>
+                      </w:r>
+                      <w:r>
+                        <w:fldChar w:fldCharType="end"/>
+                      </w:r>
+                      <w:r>
+                        <w:t>: Render HTML</w:t>
+                      </w:r>
+                    </w:p>
+                  </w:txbxContent>
+                </v:textbox>
+                <w10:wrap type="topAndBottom"/>
+              </v:shape>
+            </w:pict>
+          </mc:Fallback>
+        </mc:AlternateContent>
+      </w:r>
+      <w:r>
+        <w:drawing>
+          <wp:anchor distT="0" distB="0" distL="114300" distR="114300" simplePos="0" relativeHeight="251718656" behindDoc="0" locked="0" layoutInCell="1" allowOverlap="1" wp14:anchorId="39B117B4" wp14:editId="46668780">
+            <wp:simplePos x="0" y="0"/>
+            <wp:positionH relativeFrom="column">
+              <wp:posOffset>313065</wp:posOffset>
+            </wp:positionH>
+            <wp:positionV relativeFrom="paragraph">
+              <wp:posOffset>269819</wp:posOffset>
+            </wp:positionV>
+            <wp:extent cx="5182870" cy="2860040"/>
+            <wp:effectExtent l="0" t="0" r="0" b="0"/>
+            <wp:wrapTopAndBottom/>
+            <wp:docPr id="1181731188" name="Picture 1" descr="A screen shot of a graph&#10;&#10;AI-generated content may be incorrect."/>
+            <wp:cNvGraphicFramePr>
+              <a:graphicFrameLocks xmlns:a="http://schemas.openxmlformats.org/drawingml/2006/main" noChangeAspect="1"/>
+            </wp:cNvGraphicFramePr>
+            <a:graphic xmlns:a="http://schemas.openxmlformats.org/drawingml/2006/main">
+              <a:graphicData uri="http://schemas.openxmlformats.org/drawingml/2006/picture">
+                <pic:pic xmlns:pic="http://schemas.openxmlformats.org/drawingml/2006/picture">
+                  <pic:nvPicPr>
+                    <pic:cNvPr id="1181731188" name="Picture 1" descr="A screen shot of a graph&#10;&#10;AI-generated content may be incorrect."/>
+                    <pic:cNvPicPr/>
+                  </pic:nvPicPr>
+                  <pic:blipFill>
+                    <a:blip r:embed="rId15" cstate="print">
+                      <a:extLst>
+                        <a:ext uri="{28A0092B-C50C-407E-A947-70E740481C1C}">
+                          <a14:useLocalDpi xmlns:a14="http://schemas.microsoft.com/office/drawing/2010/main" val="0"/>
+                        </a:ext>
+                      </a:extLst>
+                    </a:blip>
+                    <a:stretch>
+                      <a:fillRect/>
+                    </a:stretch>
+                  </pic:blipFill>
+                  <pic:spPr>
+                    <a:xfrm>
+                      <a:off x="0" y="0"/>
+                      <a:ext cx="5182870" cy="2860040"/>
+                    </a:xfrm>
+                    <a:prstGeom prst="rect">
+                      <a:avLst/>
+                    </a:prstGeom>
+                  </pic:spPr>
+                </pic:pic>
+              </a:graphicData>
+            </a:graphic>
+          </wp:anchor>
+        </w:drawing>
+      </w:r>
+    </w:p>
+    <w:p>
+      <w:pPr>
+        <w:pStyle w:val="Quote"/>
+      </w:pPr>
+      <w:r>
+        <w:t>3.3 Alle Tracks muten den gleichen Bereich als einmal ‘stille.wav’ und einmal als ‘stille.mp3’ (128kbps) rendern. Wie verändert sich die Datenrate bei Stille bei wav und mp3?</w:t>
+      </w:r>
+    </w:p>
+    <w:p/>
+    <w:p>
+      <w:r>
+        <w:rPr>
+          <w:noProof/>
+        </w:rPr>
+        <mc:AlternateContent>
+          <mc:Choice Requires="wps">
+            <w:drawing>
+              <wp:anchor distT="0" distB="0" distL="114300" distR="114300" simplePos="0" relativeHeight="251723776" behindDoc="0" locked="0" layoutInCell="1" allowOverlap="1" wp14:anchorId="6762B3C5" wp14:editId="522D132D">
+                <wp:simplePos x="0" y="0"/>
+                <wp:positionH relativeFrom="column">
+                  <wp:posOffset>-635</wp:posOffset>
+                </wp:positionH>
+                <wp:positionV relativeFrom="paragraph">
+                  <wp:posOffset>825500</wp:posOffset>
+                </wp:positionV>
+                <wp:extent cx="5182870" cy="635"/>
+                <wp:effectExtent l="0" t="0" r="0" b="0"/>
+                <wp:wrapTopAndBottom/>
+                <wp:docPr id="2084726356" name="Text Box 1"/>
+                <wp:cNvGraphicFramePr/>
+                <a:graphic xmlns:a="http://schemas.openxmlformats.org/drawingml/2006/main">
+                  <a:graphicData uri="http://schemas.microsoft.com/office/word/2010/wordprocessingShape">
+                    <wps:wsp>
+                      <wps:cNvSpPr txBox="1"/>
+                      <wps:spPr>
+                        <a:xfrm>
+                          <a:off x="0" y="0"/>
+                          <a:ext cx="5182870" cy="635"/>
+                        </a:xfrm>
+                        <a:prstGeom prst="rect">
+                          <a:avLst/>
+                        </a:prstGeom>
+                        <a:solidFill>
+                          <a:prstClr val="white"/>
+                        </a:solidFill>
+                        <a:ln>
+                          <a:noFill/>
+                        </a:ln>
+                      </wps:spPr>
+                      <wps:txbx>
+                        <w:txbxContent>
+                          <w:p>
+                            <w:pPr>
+                              <w:pStyle w:val="Caption"/>
+                            </w:pPr>
+                            <w:r>
+                              <w:t xml:space="preserve">Abbildung </w:t>
+                            </w:r>
+                            <w:r>
+                              <w:fldChar w:fldCharType="begin"/>
+                            </w:r>
+                            <w:r>
+                              <w:instrText xml:space="preserve"> SEQ Abbildung \* ARABIC </w:instrText>
+                            </w:r>
+                            <w:r>
+                              <w:fldChar w:fldCharType="separate"/>
+                            </w:r>
+                            <w:r>
+                              <w:rPr>
+                                <w:noProof/>
+                              </w:rPr>
+                              <w:t>9</w:t>
+                            </w:r>
+                            <w:r>
+                              <w:fldChar w:fldCharType="end"/>
+                            </w:r>
+                            <w:r>
+                              <w:t>: WAV vs MP3</w:t>
+                            </w:r>
+                          </w:p>
+                        </w:txbxContent>
+                      </wps:txbx>
+                      <wps:bodyPr rot="0" spcFirstLastPara="0" vertOverflow="overflow" horzOverflow="overflow" vert="horz" wrap="square" lIns="0" tIns="0" rIns="0" bIns="0" numCol="1" spcCol="0" rtlCol="0" fromWordArt="0" anchor="t" anchorCtr="0" forceAA="0" compatLnSpc="1">
+                        <a:prstTxWarp prst="textNoShape">
+                          <a:avLst/>
+                        </a:prstTxWarp>
+                        <a:spAutoFit/>
+                      </wps:bodyPr>
+                    </wps:wsp>
+                  </a:graphicData>
+                </a:graphic>
+              </wp:anchor>
+            </w:drawing>
+          </mc:Choice>
+          <mc:Fallback>
+            <w:pict>
+              <v:shape w14:anchorId="6762B3C5" id="_x0000_s1038" type="#_x0000_t202" style="position:absolute;left:0;text-align:left;margin-left:-.05pt;margin-top:65pt;width:408.1pt;height:.05pt;z-index:251723776;visibility:visible;mso-wrap-style:square;mso-wrap-distance-left:9pt;mso-wrap-distance-top:0;mso-wrap-distance-right:9pt;mso-wrap-distance-bottom:0;mso-position-horizontal:absolute;mso-position-horizontal-relative:text;mso-position-vertical:absolute;mso-position-vertical-relative:text;v-text-anchor:top" o:gfxdata="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" stroked="f">
+                <v:textbox style="mso-fit-shape-to-text:t" inset="0,0,0,0">
+                  <w:txbxContent>
+                    <w:p>
+                      <w:pPr>
+                        <w:pStyle w:val="Caption"/>
+                      </w:pPr>
+                      <w:r>
+                        <w:t xml:space="preserve">Abbildung </w:t>
+                      </w:r>
+                      <w:r>
+                        <w:fldChar w:fldCharType="begin"/>
+                      </w:r>
+                      <w:r>
+                        <w:instrText xml:space="preserve"> SEQ Abbildung \* ARABIC </w:instrText>
+                      </w:r>
+                      <w:r>
+                        <w:fldChar w:fldCharType="separate"/>
+                      </w:r>
+                      <w:r>
+                        <w:rPr>
+                          <w:noProof/>
+                        </w:rPr>
+                        <w:t>9</w:t>
+                      </w:r>
+                      <w:r>
+                        <w:fldChar w:fldCharType="end"/>
+                      </w:r>
+                      <w:r>
+                        <w:t>: WAV vs MP3</w:t>
+                      </w:r>
+                    </w:p>
+                  </w:txbxContent>
+                </v:textbox>
+                <w10:wrap type="topAndBottom"/>
+              </v:shape>
+            </w:pict>
+          </mc:Fallback>
+        </mc:AlternateContent>
+      </w:r>
+      <w:r>
+        <w:drawing>
+          <wp:anchor distT="0" distB="0" distL="114300" distR="114300" simplePos="0" relativeHeight="251721728" behindDoc="0" locked="0" layoutInCell="1" allowOverlap="1" wp14:anchorId="7F78CDB3" wp14:editId="598EB11A">
+            <wp:simplePos x="0" y="0"/>
+            <wp:positionH relativeFrom="column">
+              <wp:posOffset>-635</wp:posOffset>
+            </wp:positionH>
+            <wp:positionV relativeFrom="paragraph">
+              <wp:posOffset>186226</wp:posOffset>
+            </wp:positionV>
+            <wp:extent cx="5182870" cy="582295"/>
+            <wp:effectExtent l="0" t="0" r="0" b="8255"/>
+            <wp:wrapTopAndBottom/>
+            <wp:docPr id="1639062725" name="Picture 1"/>
+            <wp:cNvGraphicFramePr>
+              <a:graphicFrameLocks xmlns:a="http://schemas.openxmlformats.org/drawingml/2006/main" noChangeAspect="1"/>
+            </wp:cNvGraphicFramePr>
+            <a:graphic xmlns:a="http://schemas.openxmlformats.org/drawingml/2006/main">
+              <a:graphicData uri="http://schemas.openxmlformats.org/drawingml/2006/picture">
+                <pic:pic xmlns:pic="http://schemas.openxmlformats.org/drawingml/2006/picture">
+                  <pic:nvPicPr>
+                    <pic:cNvPr id="1639062725" name=""/>
+                    <pic:cNvPicPr/>
+                  </pic:nvPicPr>
+                  <pic:blipFill>
+                    <a:blip r:embed="rId16">
+                      <a:extLst>
+                        <a:ext uri="{28A0092B-C50C-407E-A947-70E740481C1C}">
+                          <a14:useLocalDpi xmlns:a14="http://schemas.microsoft.com/office/drawing/2010/main" val="0"/>
+                        </a:ext>
+                      </a:extLst>
+                    </a:blip>
+                    <a:stretch>
+                      <a:fillRect/>
+                    </a:stretch>
+                  </pic:blipFill>
+                  <pic:spPr>
+                    <a:xfrm>
+                      <a:off x="0" y="0"/>
+                      <a:ext cx="5182870" cy="582295"/>
+                    </a:xfrm>
+                    <a:prstGeom prst="rect">
+                      <a:avLst/>
+                    </a:prstGeom>
+                  </pic:spPr>
+                </pic:pic>
+              </a:graphicData>
+            </a:graphic>
+          </wp:anchor>
+        </w:drawing>
+      </w:r>
+    </w:p>
+    <w:p>
+      <w:r>
+        <w:lastRenderedPageBreak/>
+        <w:t>MP3 hat eine variable Datenrate, und reduziert somit bei stille die verwendeten Daten. WAV hat immer eine Konstante Datenrate, und benötigt somit auch bei stille, den selben Speicher.</w:t>
       </w:r>
     </w:p>
     <w:sectPr>
-      <w:footerReference w:type="default" r:id="rId8"/>
+      <w:footerReference w:type="default" r:id="rId17"/>
       <w:pgSz w:w="11906" w:h="16838" w:code="9"/>
       <w:pgMar w:top="1872" w:right="1872" w:bottom="1872" w:left="1872" w:header="706" w:footer="706" w:gutter="0"/>
       <w:pgNumType w:start="0"/>

</xml_diff>